<commit_message>
Aanpassingen Requirement Analyse, en Testrapport
</commit_message>
<xml_diff>
--- a/Opleverset_Project_5-6/Verslagen/Testrapport.docx
+++ b/Opleverset_Project_5-6/Verslagen/Testrapport.docx
@@ -8,12 +8,14 @@
         <w:rPr>
           <w:sz w:val="36"/>
           <w:szCs w:val="36"/>
+          <w:lang w:val="en-US"/>
         </w:rPr>
       </w:pPr>
       <w:r>
         <w:rPr>
           <w:sz w:val="36"/>
           <w:szCs w:val="36"/>
+          <w:lang w:val="en-US"/>
         </w:rPr>
         <w:t>Testrapport</w:t>
       </w:r>
@@ -26,6 +28,7 @@
           <w:bCs/>
           <w:sz w:val="36"/>
           <w:szCs w:val="36"/>
+          <w:lang w:val="en-US"/>
         </w:rPr>
       </w:pPr>
     </w:p>
@@ -37,69 +40,113 @@
           <w:bCs/>
           <w:sz w:val="36"/>
           <w:szCs w:val="36"/>
+          <w:lang w:val="en-US"/>
         </w:rPr>
       </w:pPr>
     </w:p>
     <w:p>
       <w:pPr>
         <w:jc w:val="center"/>
-        <w:rPr>
-          <w:b/>
-          <w:bCs/>
-          <w:sz w:val="36"/>
-          <w:szCs w:val="36"/>
-        </w:rPr>
-      </w:pPr>
-      <w:r>
         <w:rPr>
           <w:b/>
           <w:bCs/>
           <w:noProof/>
           <w:sz w:val="36"/>
           <w:szCs w:val="36"/>
-        </w:rPr>
-        <w:drawing>
-          <wp:inline distT="0" distB="0" distL="0" distR="0" wp14:anchorId="08EFA06B" wp14:editId="51D435F1">
-            <wp:extent cx="5618603" cy="3810000"/>
-            <wp:effectExtent l="0" t="0" r="1270" b="0"/>
-            <wp:docPr id="1052481500" name="Afbeelding 2"/>
-            <wp:cNvGraphicFramePr>
-              <a:graphicFrameLocks xmlns:a="http://schemas.openxmlformats.org/drawingml/2006/main" noChangeAspect="1"/>
-            </wp:cNvGraphicFramePr>
-            <a:graphic xmlns:a="http://schemas.openxmlformats.org/drawingml/2006/main">
-              <a:graphicData uri="http://schemas.openxmlformats.org/drawingml/2006/picture">
-                <pic:pic xmlns:pic="http://schemas.openxmlformats.org/drawingml/2006/picture">
-                  <pic:nvPicPr>
-                    <pic:cNvPr id="1052481500" name="Afbeelding 1052481500"/>
-                    <pic:cNvPicPr/>
-                  </pic:nvPicPr>
-                  <pic:blipFill>
-                    <a:blip r:embed="rId5">
-                      <a:extLst>
-                        <a:ext uri="{28A0092B-C50C-407E-A947-70E740481C1C}">
-                          <a14:useLocalDpi xmlns:a14="http://schemas.microsoft.com/office/drawing/2010/main" val="0"/>
-                        </a:ext>
-                      </a:extLst>
-                    </a:blip>
-                    <a:stretch>
-                      <a:fillRect/>
-                    </a:stretch>
-                  </pic:blipFill>
-                  <pic:spPr>
-                    <a:xfrm>
-                      <a:off x="0" y="0"/>
-                      <a:ext cx="5637725" cy="3822967"/>
-                    </a:xfrm>
-                    <a:prstGeom prst="rect">
-                      <a:avLst/>
-                    </a:prstGeom>
-                  </pic:spPr>
-                </pic:pic>
-              </a:graphicData>
-            </a:graphic>
-          </wp:inline>
-        </w:drawing>
-      </w:r>
+          <w:lang w:val="en-US"/>
+        </w:rPr>
+      </w:pPr>
+    </w:p>
+    <w:p>
+      <w:pPr>
+        <w:jc w:val="center"/>
+        <w:rPr>
+          <w:b/>
+          <w:bCs/>
+          <w:noProof/>
+          <w:sz w:val="36"/>
+          <w:szCs w:val="36"/>
+          <w:lang w:val="en-US"/>
+        </w:rPr>
+      </w:pPr>
+    </w:p>
+    <w:p>
+      <w:pPr>
+        <w:jc w:val="center"/>
+        <w:rPr>
+          <w:b/>
+          <w:bCs/>
+          <w:noProof/>
+          <w:sz w:val="36"/>
+          <w:szCs w:val="36"/>
+          <w:lang w:val="en-US"/>
+        </w:rPr>
+      </w:pPr>
+    </w:p>
+    <w:p>
+      <w:pPr>
+        <w:jc w:val="center"/>
+        <w:rPr>
+          <w:b/>
+          <w:bCs/>
+          <w:noProof/>
+          <w:sz w:val="36"/>
+          <w:szCs w:val="36"/>
+          <w:lang w:val="en-US"/>
+        </w:rPr>
+      </w:pPr>
+    </w:p>
+    <w:p>
+      <w:pPr>
+        <w:jc w:val="center"/>
+        <w:rPr>
+          <w:b/>
+          <w:bCs/>
+          <w:noProof/>
+          <w:sz w:val="36"/>
+          <w:szCs w:val="36"/>
+          <w:lang w:val="en-US"/>
+        </w:rPr>
+      </w:pPr>
+    </w:p>
+    <w:p>
+      <w:pPr>
+        <w:jc w:val="center"/>
+        <w:rPr>
+          <w:b/>
+          <w:bCs/>
+          <w:noProof/>
+          <w:sz w:val="36"/>
+          <w:szCs w:val="36"/>
+          <w:lang w:val="en-US"/>
+        </w:rPr>
+      </w:pPr>
+    </w:p>
+    <w:p>
+      <w:pPr>
+        <w:jc w:val="center"/>
+        <w:rPr>
+          <w:b/>
+          <w:bCs/>
+          <w:noProof/>
+          <w:sz w:val="36"/>
+          <w:szCs w:val="36"/>
+          <w:lang w:val="en-US"/>
+        </w:rPr>
+      </w:pPr>
+    </w:p>
+    <w:p>
+      <w:pPr>
+        <w:jc w:val="center"/>
+        <w:rPr>
+          <w:b/>
+          <w:bCs/>
+          <w:noProof/>
+          <w:sz w:val="36"/>
+          <w:szCs w:val="36"/>
+          <w:lang w:val="en-US"/>
+        </w:rPr>
+      </w:pPr>
     </w:p>
     <w:p>
       <w:pPr>
@@ -109,6 +156,7 @@
           <w:bCs/>
           <w:sz w:val="36"/>
           <w:szCs w:val="36"/>
+          <w:lang w:val="en-US"/>
         </w:rPr>
       </w:pPr>
     </w:p>
@@ -120,6 +168,7 @@
           <w:bCs/>
           <w:sz w:val="36"/>
           <w:szCs w:val="36"/>
+          <w:lang w:val="en-US"/>
         </w:rPr>
       </w:pPr>
     </w:p>
@@ -131,11 +180,36 @@
           <w:bCs/>
           <w:sz w:val="36"/>
           <w:szCs w:val="36"/>
-        </w:rPr>
-      </w:pPr>
-    </w:p>
-    <w:p/>
-    <w:p/>
+          <w:lang w:val="en-US"/>
+        </w:rPr>
+      </w:pPr>
+    </w:p>
+    <w:p>
+      <w:pPr>
+        <w:jc w:val="center"/>
+        <w:rPr>
+          <w:b/>
+          <w:bCs/>
+          <w:sz w:val="36"/>
+          <w:szCs w:val="36"/>
+          <w:lang w:val="en-US"/>
+        </w:rPr>
+      </w:pPr>
+    </w:p>
+    <w:p>
+      <w:pPr>
+        <w:rPr>
+          <w:lang w:val="en-US"/>
+        </w:rPr>
+      </w:pPr>
+    </w:p>
+    <w:p>
+      <w:pPr>
+        <w:rPr>
+          <w:lang w:val="en-US"/>
+        </w:rPr>
+      </w:pPr>
+    </w:p>
     <w:p>
       <w:pPr>
         <w:rPr>
@@ -848,19 +922,13 @@
         <w:spacing w:line="276" w:lineRule="auto"/>
       </w:pPr>
       <w:r>
-        <w:t xml:space="preserve">Voor deze test is er een Raspberry PI nodig, met daarop alle benodigde code/materialen. Er </w:t>
-      </w:r>
-      <w:r>
-        <w:t>zijn</w:t>
-      </w:r>
-      <w:r>
-        <w:t xml:space="preserve"> ook</w:t>
-      </w:r>
-      <w:r>
-        <w:t xml:space="preserve"> camera’s nodig, de camera’s die wij hebben zijn de Arducam en de Waveshare. De Arducam kan aangesloten worden door middel van een USB connectie, de Waveshare kan aangesloten worden door middel van 2 ribbon kabels 1-b.</w:t>
-      </w:r>
-      <w:r>
-        <w:t xml:space="preserve"> Er is ook een scherm nodig voor de Raspberry PI om de resultaten te laten zien. Ook is er een object nodig die op de afstanden van 1 Meter, 2 Meter en 3 Meter gehouden worden.</w:t>
+        <w:t>Voor de benodigde componenten, zie in de Requirement Analyse</w:t>
+      </w:r>
+      <w:r>
+        <w:t xml:space="preserve"> de ‘Betrokken Componenten’ bij RQ01. Deze test wordt gedaan met een object dat op 1, 2 en 3 meter va</w:t>
+      </w:r>
+      <w:r>
+        <w:t>n de camera afgehouden wordt.</w:t>
       </w:r>
     </w:p>
     <w:p>
@@ -1066,719 +1134,6 @@
           <w:lang w:val="en-US"/>
         </w:rPr>
         <w:t>// TO-DO</w:t>
-      </w:r>
-    </w:p>
-    <w:p>
-      <w:pPr>
-        <w:pStyle w:val="Kop2"/>
-        <w:spacing w:line="240" w:lineRule="auto"/>
-      </w:pPr>
-      <w:bookmarkStart w:id="2" w:name="_Toc213836355"/>
-      <w:r>
-        <w:lastRenderedPageBreak/>
-        <w:t>Test 2: RQ0</w:t>
-      </w:r>
-      <w:r>
-        <w:t>3</w:t>
-      </w:r>
-      <w:r>
-        <w:t>: Afstand Detectie</w:t>
-      </w:r>
-      <w:bookmarkEnd w:id="2"/>
-    </w:p>
-    <w:p>
-      <w:pPr>
-        <w:spacing w:line="240" w:lineRule="auto"/>
-        <w:rPr>
-          <w:sz w:val="26"/>
-          <w:szCs w:val="26"/>
-        </w:rPr>
-      </w:pPr>
-      <w:r>
-        <w:rPr>
-          <w:sz w:val="26"/>
-          <w:szCs w:val="26"/>
-        </w:rPr>
-        <w:t>Testdoel:</w:t>
-      </w:r>
-    </w:p>
-    <w:p>
-      <w:pPr>
-        <w:spacing w:line="240" w:lineRule="auto"/>
-      </w:pPr>
-      <w:r>
-        <w:t>In deze test</w:t>
-      </w:r>
-      <w:r>
-        <w:t xml:space="preserve"> gaat er gekeken worden of het systeem de afstand van een object tot de camera’s laten zien.</w:t>
-      </w:r>
-    </w:p>
-    <w:p>
-      <w:pPr>
-        <w:spacing w:line="240" w:lineRule="auto"/>
-        <w:rPr>
-          <w:sz w:val="26"/>
-          <w:szCs w:val="26"/>
-        </w:rPr>
-      </w:pPr>
-      <w:r>
-        <w:rPr>
-          <w:sz w:val="26"/>
-          <w:szCs w:val="26"/>
-        </w:rPr>
-        <w:t>Test Opstelling</w:t>
-      </w:r>
-      <w:r>
-        <w:rPr>
-          <w:sz w:val="26"/>
-          <w:szCs w:val="26"/>
-        </w:rPr>
-        <w:t>:</w:t>
-      </w:r>
-    </w:p>
-    <w:p>
-      <w:pPr>
-        <w:spacing w:line="240" w:lineRule="auto"/>
-      </w:pPr>
-      <w:r>
-        <w:t>Voor deze test is er een Raspberry PI nodig, met daarop alle benodigde code/materialen. Er zijn ook camera’s nodig, de camera’s die wij hebben zijn de Arducam en de Waveshare. De Arducam kan aangesloten worden door middel van een USB connectie, de Waveshare kan aangesloten worden door middel van 2 ribbon kabels 1-b. Er is ook een scherm nodig voor de Raspberry PI om de resultaten te laten zien. Ook is er een object nodig die op de afstanden van 1 Meter, 2 Meter en 3 Meter gehouden worden.</w:t>
-      </w:r>
-    </w:p>
-    <w:p>
-      <w:pPr>
-        <w:spacing w:line="240" w:lineRule="auto"/>
-        <w:rPr>
-          <w:sz w:val="26"/>
-          <w:szCs w:val="26"/>
-        </w:rPr>
-      </w:pPr>
-      <w:r>
-        <w:rPr>
-          <w:sz w:val="26"/>
-          <w:szCs w:val="26"/>
-        </w:rPr>
-        <w:t>Uitvoer:</w:t>
-      </w:r>
-    </w:p>
-    <w:p>
-      <w:pPr>
-        <w:spacing w:line="240" w:lineRule="auto"/>
-      </w:pPr>
-      <w:r>
-        <w:t>1. Verbind de camera’s/camera met de juiste kabels (USB voor Arducam, ribbon kabel voor Waveshare) en voorzie de Raspberry PI van stroom.</w:t>
-      </w:r>
-    </w:p>
-    <w:p>
-      <w:pPr>
-        <w:spacing w:line="240" w:lineRule="auto"/>
-      </w:pPr>
-      <w:r>
-        <w:t>2. Run via de Raspberry PI het code bestand ‘main.py’ door in de terminal onder pad ‘~/Project5-6/Opleverset_Project_5-6/Code’ ‘python main.py’ in te typen en op enter te drukken.</w:t>
-      </w:r>
-    </w:p>
-    <w:p>
-      <w:pPr>
-        <w:spacing w:line="240" w:lineRule="auto"/>
-      </w:pPr>
-      <w:r>
-        <w:t>3. Observeer of beide camera’s werken en</w:t>
-      </w:r>
-      <w:r>
-        <w:t xml:space="preserve"> of de camera’s de juiste dingen op het scherm laten zien.</w:t>
-      </w:r>
-    </w:p>
-    <w:p>
-      <w:pPr>
-        <w:spacing w:line="240" w:lineRule="auto"/>
-      </w:pPr>
-      <w:r>
-        <w:t>4. Hou een object op 1, 2 en 3 meter afstand en observeer op de monitor bij de 1, 2 en 3 meter of de afstand van de camera tot het object goed wordt weergegeven</w:t>
-      </w:r>
-    </w:p>
-    <w:p>
-      <w:pPr>
-        <w:spacing w:line="240" w:lineRule="auto"/>
-        <w:rPr>
-          <w:sz w:val="26"/>
-          <w:szCs w:val="26"/>
-        </w:rPr>
-      </w:pPr>
-      <w:r>
-        <w:rPr>
-          <w:sz w:val="26"/>
-          <w:szCs w:val="26"/>
-        </w:rPr>
-        <w:t>Verwachte resultaat</w:t>
-      </w:r>
-    </w:p>
-    <w:p>
-      <w:pPr>
-        <w:spacing w:line="240" w:lineRule="auto"/>
-        <w:rPr>
-          <w:sz w:val="26"/>
-          <w:szCs w:val="26"/>
-        </w:rPr>
-      </w:pPr>
-      <w:r>
-        <w:rPr>
-          <w:sz w:val="26"/>
-          <w:szCs w:val="26"/>
-        </w:rPr>
-        <w:t>De Raspberry PI</w:t>
-      </w:r>
-      <w:r>
-        <w:rPr>
-          <w:sz w:val="26"/>
-          <w:szCs w:val="26"/>
-        </w:rPr>
-        <w:t xml:space="preserve"> zal de afstanden waarop het object van de camera’s staat juist weergegeven worden op het scherm.</w:t>
-      </w:r>
-    </w:p>
-    <w:p>
-      <w:pPr>
-        <w:spacing w:line="240" w:lineRule="auto"/>
-        <w:rPr>
-          <w:sz w:val="26"/>
-          <w:szCs w:val="26"/>
-        </w:rPr>
-      </w:pPr>
-      <w:r>
-        <w:rPr>
-          <w:sz w:val="26"/>
-          <w:szCs w:val="26"/>
-        </w:rPr>
-        <w:t>Acceptatie Criteria:</w:t>
-      </w:r>
-    </w:p>
-    <w:p>
-      <w:pPr>
-        <w:spacing w:line="240" w:lineRule="auto"/>
-        <w:rPr>
-          <w:sz w:val="26"/>
-          <w:szCs w:val="26"/>
-        </w:rPr>
-      </w:pPr>
-      <w:r>
-        <w:rPr>
-          <w:sz w:val="26"/>
-          <w:szCs w:val="26"/>
-        </w:rPr>
-        <w:t>De afstanden zijn juist weergegeven met een maximaal verschil tot de echte afstand van 0.1</w:t>
-      </w:r>
-    </w:p>
-    <w:p>
-      <w:pPr>
-        <w:spacing w:line="240" w:lineRule="auto"/>
-        <w:rPr>
-          <w:sz w:val="26"/>
-          <w:szCs w:val="26"/>
-        </w:rPr>
-      </w:pPr>
-      <w:r>
-        <w:rPr>
-          <w:sz w:val="26"/>
-          <w:szCs w:val="26"/>
-        </w:rPr>
-        <w:t>Waarnemingen</w:t>
-      </w:r>
-      <w:r>
-        <w:rPr>
-          <w:sz w:val="26"/>
-          <w:szCs w:val="26"/>
-        </w:rPr>
-        <w:t>:</w:t>
-      </w:r>
-    </w:p>
-    <w:p>
-      <w:pPr>
-        <w:spacing w:line="240" w:lineRule="auto"/>
-        <w:rPr>
-          <w:sz w:val="26"/>
-          <w:szCs w:val="26"/>
-          <w:lang w:val="en-US"/>
-        </w:rPr>
-      </w:pPr>
-      <w:r>
-        <w:rPr>
-          <w:sz w:val="26"/>
-          <w:szCs w:val="26"/>
-          <w:lang w:val="en-US"/>
-        </w:rPr>
-        <w:t>//TO-DO</w:t>
-      </w:r>
-    </w:p>
-    <w:p>
-      <w:pPr>
-        <w:spacing w:line="240" w:lineRule="auto"/>
-        <w:rPr>
-          <w:sz w:val="26"/>
-          <w:szCs w:val="26"/>
-          <w:lang w:val="en-US"/>
-        </w:rPr>
-      </w:pPr>
-      <w:r>
-        <w:rPr>
-          <w:sz w:val="26"/>
-          <w:szCs w:val="26"/>
-          <w:lang w:val="en-US"/>
-        </w:rPr>
-        <w:t>Conclusie:</w:t>
-      </w:r>
-    </w:p>
-    <w:p>
-      <w:pPr>
-        <w:spacing w:line="240" w:lineRule="auto"/>
-        <w:rPr>
-          <w:sz w:val="26"/>
-          <w:szCs w:val="26"/>
-          <w:lang w:val="en-US"/>
-        </w:rPr>
-      </w:pPr>
-      <w:r>
-        <w:rPr>
-          <w:sz w:val="26"/>
-          <w:szCs w:val="26"/>
-          <w:lang w:val="en-US"/>
-        </w:rPr>
-        <w:t>// TO-D</w:t>
-      </w:r>
-      <w:r>
-        <w:rPr>
-          <w:sz w:val="26"/>
-          <w:szCs w:val="26"/>
-          <w:lang w:val="en-US"/>
-        </w:rPr>
-        <w:t>O</w:t>
-      </w:r>
-      <w:r>
-        <w:rPr>
-          <w:sz w:val="26"/>
-          <w:szCs w:val="26"/>
-          <w:lang w:val="en-US"/>
-        </w:rPr>
-        <w:br w:type="page"/>
-      </w:r>
-    </w:p>
-    <w:p>
-      <w:pPr>
-        <w:pStyle w:val="Kop2"/>
-      </w:pPr>
-      <w:bookmarkStart w:id="3" w:name="_Toc213836356"/>
-      <w:r>
-        <w:lastRenderedPageBreak/>
-        <w:t xml:space="preserve">Test </w:t>
-      </w:r>
-      <w:r>
-        <w:t>3</w:t>
-      </w:r>
-      <w:r>
-        <w:t>: RQ</w:t>
-      </w:r>
-      <w:r>
-        <w:t>04</w:t>
-      </w:r>
-      <w:r>
-        <w:t>: Grafiek</w:t>
-      </w:r>
-      <w:bookmarkEnd w:id="3"/>
-    </w:p>
-    <w:p>
-      <w:pPr>
-        <w:spacing w:line="276" w:lineRule="auto"/>
-        <w:rPr>
-          <w:sz w:val="26"/>
-          <w:szCs w:val="26"/>
-        </w:rPr>
-      </w:pPr>
-      <w:r>
-        <w:rPr>
-          <w:sz w:val="26"/>
-          <w:szCs w:val="26"/>
-        </w:rPr>
-        <w:t>Testdoel:</w:t>
-      </w:r>
-    </w:p>
-    <w:p>
-      <w:pPr>
-        <w:spacing w:line="276" w:lineRule="auto"/>
-      </w:pPr>
-      <w:r>
-        <w:t xml:space="preserve">In deze test wordt er gekeken </w:t>
-      </w:r>
-      <w:r>
-        <w:t xml:space="preserve">naar of de GUI ook een duidelijk en werkend tabel heeft, waarin </w:t>
-      </w:r>
-      <w:r>
-        <w:t xml:space="preserve">de locatie’s van gedetecteerde objecten </w:t>
-      </w:r>
-      <w:r>
-        <w:t>worden laten zien, en elke .5 secondes wordt ge-update</w:t>
-      </w:r>
-      <w:r>
-        <w:t>.</w:t>
-      </w:r>
-    </w:p>
-    <w:p>
-      <w:pPr>
-        <w:spacing w:line="276" w:lineRule="auto"/>
-        <w:rPr>
-          <w:sz w:val="26"/>
-          <w:szCs w:val="26"/>
-        </w:rPr>
-      </w:pPr>
-      <w:r>
-        <w:rPr>
-          <w:sz w:val="26"/>
-          <w:szCs w:val="26"/>
-        </w:rPr>
-        <w:t>Test Opstelling:</w:t>
-      </w:r>
-    </w:p>
-    <w:p>
-      <w:pPr>
-        <w:spacing w:line="276" w:lineRule="auto"/>
-      </w:pPr>
-      <w:r>
-        <w:t xml:space="preserve">Voor deze test is er een </w:t>
-      </w:r>
-      <w:r>
-        <w:t>Raspberry PI nodig, met daarop code om een object te detecteren en weer te geven in een tabel</w:t>
-      </w:r>
-      <w:r>
-        <w:t>.</w:t>
-      </w:r>
-      <w:r>
-        <w:t xml:space="preserve"> </w:t>
-      </w:r>
-      <w:r>
-        <w:t>Er zijn ook camera’s nodig</w:t>
-      </w:r>
-    </w:p>
-    <w:p>
-      <w:pPr>
-        <w:spacing w:line="276" w:lineRule="auto"/>
-        <w:rPr>
-          <w:sz w:val="26"/>
-          <w:szCs w:val="26"/>
-        </w:rPr>
-      </w:pPr>
-      <w:r>
-        <w:rPr>
-          <w:sz w:val="26"/>
-          <w:szCs w:val="26"/>
-        </w:rPr>
-        <w:t>Uitvoering:</w:t>
-      </w:r>
-    </w:p>
-    <w:p>
-      <w:pPr>
-        <w:spacing w:line="276" w:lineRule="auto"/>
-      </w:pPr>
-    </w:p>
-    <w:p>
-      <w:pPr>
-        <w:spacing w:line="276" w:lineRule="auto"/>
-        <w:rPr>
-          <w:sz w:val="26"/>
-          <w:szCs w:val="26"/>
-        </w:rPr>
-      </w:pPr>
-      <w:r>
-        <w:rPr>
-          <w:sz w:val="26"/>
-          <w:szCs w:val="26"/>
-        </w:rPr>
-        <w:t>Verwac</w:t>
-      </w:r>
-      <w:r>
-        <w:rPr>
-          <w:sz w:val="26"/>
-          <w:szCs w:val="26"/>
-        </w:rPr>
-        <w:t>hte Resultaat</w:t>
-      </w:r>
-      <w:r>
-        <w:rPr>
-          <w:sz w:val="26"/>
-          <w:szCs w:val="26"/>
-        </w:rPr>
-        <w:t>:</w:t>
-      </w:r>
-    </w:p>
-    <w:p>
-      <w:pPr>
-        <w:spacing w:line="276" w:lineRule="auto"/>
-      </w:pPr>
-    </w:p>
-    <w:p>
-      <w:pPr>
-        <w:spacing w:line="276" w:lineRule="auto"/>
-        <w:rPr>
-          <w:sz w:val="26"/>
-          <w:szCs w:val="26"/>
-        </w:rPr>
-      </w:pPr>
-      <w:r>
-        <w:rPr>
-          <w:sz w:val="26"/>
-          <w:szCs w:val="26"/>
-        </w:rPr>
-        <w:t>Acceptatie Criteria:</w:t>
-      </w:r>
-    </w:p>
-    <w:p>
-      <w:pPr>
-        <w:spacing w:line="276" w:lineRule="auto"/>
-      </w:pPr>
-    </w:p>
-    <w:p>
-      <w:pPr>
-        <w:spacing w:line="276" w:lineRule="auto"/>
-        <w:rPr>
-          <w:sz w:val="26"/>
-          <w:szCs w:val="26"/>
-        </w:rPr>
-      </w:pPr>
-      <w:r>
-        <w:rPr>
-          <w:sz w:val="26"/>
-          <w:szCs w:val="26"/>
-        </w:rPr>
-        <w:t>Waarnemingen:</w:t>
-      </w:r>
-    </w:p>
-    <w:p>
-      <w:pPr>
-        <w:spacing w:line="276" w:lineRule="auto"/>
-      </w:pPr>
-      <w:r>
-        <w:t>//To-Do</w:t>
-      </w:r>
-    </w:p>
-    <w:p>
-      <w:pPr>
-        <w:spacing w:line="276" w:lineRule="auto"/>
-        <w:rPr>
-          <w:sz w:val="26"/>
-          <w:szCs w:val="26"/>
-        </w:rPr>
-      </w:pPr>
-      <w:r>
-        <w:rPr>
-          <w:sz w:val="26"/>
-          <w:szCs w:val="26"/>
-        </w:rPr>
-        <w:t>Conclusie:</w:t>
-      </w:r>
-    </w:p>
-    <w:p>
-      <w:pPr>
-        <w:spacing w:line="276" w:lineRule="auto"/>
-      </w:pPr>
-      <w:r>
-        <w:t>//To-Do</w:t>
-      </w:r>
-    </w:p>
-    <w:p>
-      <w:r>
-        <w:br w:type="page"/>
-      </w:r>
-    </w:p>
-    <w:p>
-      <w:pPr>
-        <w:pStyle w:val="Kop2"/>
-      </w:pPr>
-      <w:bookmarkStart w:id="4" w:name="_Toc213836357"/>
-      <w:r>
-        <w:lastRenderedPageBreak/>
-        <w:t xml:space="preserve">Test </w:t>
-      </w:r>
-      <w:r>
-        <w:t>4</w:t>
-      </w:r>
-      <w:r>
-        <w:t>: RQ05</w:t>
-      </w:r>
-      <w:r>
-        <w:t>: Camera-Overzicht</w:t>
-      </w:r>
-      <w:bookmarkEnd w:id="4"/>
-    </w:p>
-    <w:p>
-      <w:pPr>
-        <w:spacing w:line="276" w:lineRule="auto"/>
-        <w:rPr>
-          <w:sz w:val="26"/>
-          <w:szCs w:val="26"/>
-        </w:rPr>
-      </w:pPr>
-      <w:r>
-        <w:rPr>
-          <w:sz w:val="26"/>
-          <w:szCs w:val="26"/>
-        </w:rPr>
-        <w:t>Testdoel:</w:t>
-      </w:r>
-    </w:p>
-    <w:p>
-      <w:pPr>
-        <w:spacing w:line="276" w:lineRule="auto"/>
-      </w:pPr>
-      <w:r>
-        <w:t xml:space="preserve">In deze test wordt er gekeken naar of de GUI </w:t>
-      </w:r>
-    </w:p>
-    <w:p>
-      <w:pPr>
-        <w:spacing w:line="276" w:lineRule="auto"/>
-        <w:rPr>
-          <w:sz w:val="26"/>
-          <w:szCs w:val="26"/>
-        </w:rPr>
-      </w:pPr>
-      <w:r>
-        <w:rPr>
-          <w:sz w:val="26"/>
-          <w:szCs w:val="26"/>
-        </w:rPr>
-        <w:t>Test Opstelling:</w:t>
-      </w:r>
-    </w:p>
-    <w:p>
-      <w:pPr>
-        <w:spacing w:line="276" w:lineRule="auto"/>
-      </w:pPr>
-    </w:p>
-    <w:p>
-      <w:pPr>
-        <w:spacing w:line="276" w:lineRule="auto"/>
-        <w:rPr>
-          <w:sz w:val="26"/>
-          <w:szCs w:val="26"/>
-        </w:rPr>
-      </w:pPr>
-      <w:r>
-        <w:rPr>
-          <w:sz w:val="26"/>
-          <w:szCs w:val="26"/>
-        </w:rPr>
-        <w:t>Uitvoering:</w:t>
-      </w:r>
-    </w:p>
-    <w:p>
-      <w:pPr>
-        <w:spacing w:line="276" w:lineRule="auto"/>
-      </w:pPr>
-    </w:p>
-    <w:p>
-      <w:pPr>
-        <w:spacing w:line="276" w:lineRule="auto"/>
-        <w:rPr>
-          <w:sz w:val="26"/>
-          <w:szCs w:val="26"/>
-        </w:rPr>
-      </w:pPr>
-      <w:r>
-        <w:rPr>
-          <w:sz w:val="26"/>
-          <w:szCs w:val="26"/>
-        </w:rPr>
-        <w:t>Verwachte Resultaat:</w:t>
-      </w:r>
-    </w:p>
-    <w:p>
-      <w:pPr>
-        <w:spacing w:line="276" w:lineRule="auto"/>
-      </w:pPr>
-    </w:p>
-    <w:p>
-      <w:pPr>
-        <w:spacing w:line="276" w:lineRule="auto"/>
-        <w:rPr>
-          <w:sz w:val="26"/>
-          <w:szCs w:val="26"/>
-          <w:lang w:val="en-US"/>
-        </w:rPr>
-      </w:pPr>
-      <w:r>
-        <w:rPr>
-          <w:sz w:val="26"/>
-          <w:szCs w:val="26"/>
-          <w:lang w:val="en-US"/>
-        </w:rPr>
-        <w:t>Acceptatie Criteria:</w:t>
-      </w:r>
-    </w:p>
-    <w:p>
-      <w:pPr>
-        <w:spacing w:line="276" w:lineRule="auto"/>
-        <w:rPr>
-          <w:lang w:val="en-US"/>
-        </w:rPr>
-      </w:pPr>
-    </w:p>
-    <w:p>
-      <w:pPr>
-        <w:spacing w:line="276" w:lineRule="auto"/>
-        <w:rPr>
-          <w:sz w:val="26"/>
-          <w:szCs w:val="26"/>
-          <w:lang w:val="en-US"/>
-        </w:rPr>
-      </w:pPr>
-      <w:r>
-        <w:rPr>
-          <w:sz w:val="26"/>
-          <w:szCs w:val="26"/>
-          <w:lang w:val="en-US"/>
-        </w:rPr>
-        <w:t>Waarnemingen:</w:t>
-      </w:r>
-    </w:p>
-    <w:p>
-      <w:pPr>
-        <w:spacing w:line="276" w:lineRule="auto"/>
-        <w:rPr>
-          <w:lang w:val="en-US"/>
-        </w:rPr>
-      </w:pPr>
-      <w:r>
-        <w:rPr>
-          <w:lang w:val="en-US"/>
-        </w:rPr>
-        <w:t>//To-Do</w:t>
-      </w:r>
-    </w:p>
-    <w:p>
-      <w:pPr>
-        <w:spacing w:line="276" w:lineRule="auto"/>
-        <w:rPr>
-          <w:sz w:val="26"/>
-          <w:szCs w:val="26"/>
-          <w:lang w:val="en-US"/>
-        </w:rPr>
-      </w:pPr>
-      <w:r>
-        <w:rPr>
-          <w:sz w:val="26"/>
-          <w:szCs w:val="26"/>
-          <w:lang w:val="en-US"/>
-        </w:rPr>
-        <w:t>Conclusie:</w:t>
-      </w:r>
-    </w:p>
-    <w:p>
-      <w:pPr>
-        <w:spacing w:line="276" w:lineRule="auto"/>
-        <w:rPr>
-          <w:lang w:val="en-US"/>
-        </w:rPr>
-      </w:pPr>
-      <w:r>
-        <w:rPr>
-          <w:lang w:val="en-US"/>
-        </w:rPr>
-        <w:t>//To-Do</w:t>
       </w:r>
     </w:p>
     <w:p>
@@ -1788,33 +1143,342 @@
           <w:color w:val="0F4761" w:themeColor="accent1" w:themeShade="BF"/>
           <w:sz w:val="32"/>
           <w:szCs w:val="32"/>
-          <w:lang w:val="en-US"/>
-        </w:rPr>
-      </w:pPr>
-      <w:r>
-        <w:rPr>
-          <w:lang w:val="en-US"/>
-        </w:rPr>
+        </w:rPr>
+      </w:pPr>
+      <w:bookmarkStart w:id="2" w:name="_Toc213836355"/>
+      <w:r>
         <w:br w:type="page"/>
       </w:r>
     </w:p>
     <w:p>
       <w:pPr>
         <w:pStyle w:val="Kop2"/>
-        <w:spacing w:line="276" w:lineRule="auto"/>
-      </w:pPr>
-      <w:bookmarkStart w:id="5" w:name="_Toc213836358"/>
+        <w:spacing w:line="240" w:lineRule="auto"/>
+      </w:pPr>
+      <w:r>
+        <w:lastRenderedPageBreak/>
+        <w:t>Test 2: RQ0</w:t>
+      </w:r>
+      <w:r>
+        <w:t>3</w:t>
+      </w:r>
+      <w:r>
+        <w:t>: Afstand Detectie</w:t>
+      </w:r>
+      <w:bookmarkEnd w:id="2"/>
+    </w:p>
+    <w:p>
+      <w:pPr>
+        <w:spacing w:line="240" w:lineRule="auto"/>
+        <w:rPr>
+          <w:sz w:val="26"/>
+          <w:szCs w:val="26"/>
+        </w:rPr>
+      </w:pPr>
+      <w:r>
+        <w:rPr>
+          <w:sz w:val="26"/>
+          <w:szCs w:val="26"/>
+        </w:rPr>
+        <w:t>Testdoel:</w:t>
+      </w:r>
+    </w:p>
+    <w:p>
+      <w:pPr>
+        <w:spacing w:line="240" w:lineRule="auto"/>
+      </w:pPr>
+      <w:r>
+        <w:t>In deze test</w:t>
+      </w:r>
+      <w:r>
+        <w:t xml:space="preserve"> gaat er gekeken worden of het systeem de afstand van een object tot de camera’s laten zien.</w:t>
+      </w:r>
+    </w:p>
+    <w:p>
+      <w:pPr>
+        <w:spacing w:line="240" w:lineRule="auto"/>
+        <w:rPr>
+          <w:sz w:val="26"/>
+          <w:szCs w:val="26"/>
+        </w:rPr>
+      </w:pPr>
+      <w:r>
+        <w:rPr>
+          <w:sz w:val="26"/>
+          <w:szCs w:val="26"/>
+        </w:rPr>
+        <w:t>Test Opstelling</w:t>
+      </w:r>
+      <w:r>
+        <w:rPr>
+          <w:sz w:val="26"/>
+          <w:szCs w:val="26"/>
+        </w:rPr>
+        <w:t>:</w:t>
+      </w:r>
+    </w:p>
+    <w:p>
+      <w:pPr>
+        <w:spacing w:line="276" w:lineRule="auto"/>
+      </w:pPr>
+      <w:r>
+        <w:t>Voor de benodigde componenten, zie in de Requirement Analyse de ‘Betrokken Componenten’ bij RQ0</w:t>
+      </w:r>
+      <w:r>
+        <w:t>3</w:t>
+      </w:r>
+      <w:r>
+        <w:t>. Deze test wordt gedaan met een object dat op 1, 2 en 3 meter van de camera afgehouden wordt.</w:t>
+      </w:r>
+    </w:p>
+    <w:p>
+      <w:pPr>
+        <w:spacing w:line="240" w:lineRule="auto"/>
+        <w:rPr>
+          <w:sz w:val="26"/>
+          <w:szCs w:val="26"/>
+        </w:rPr>
+      </w:pPr>
+      <w:r>
+        <w:rPr>
+          <w:sz w:val="26"/>
+          <w:szCs w:val="26"/>
+        </w:rPr>
+        <w:t>Uitvoer:</w:t>
+      </w:r>
+    </w:p>
+    <w:p>
+      <w:pPr>
+        <w:spacing w:line="240" w:lineRule="auto"/>
+      </w:pPr>
+      <w:r>
+        <w:t>1. Verbind de camera’s/camera met de juiste kabels (USB voor Arducam, ribbon kabel voor Waveshare) en voorzie de Raspberry PI van stroom.</w:t>
+      </w:r>
+    </w:p>
+    <w:p>
+      <w:pPr>
+        <w:spacing w:line="240" w:lineRule="auto"/>
+      </w:pPr>
+      <w:r>
+        <w:t>2. Run via de Raspberry PI het code bestand ‘main.py’ door in de terminal onder pad ‘~/Project5-6/Opleverset_Project_5-6/Code’ ‘python main.py’ in te typen en op enter te drukken.</w:t>
+      </w:r>
+    </w:p>
+    <w:p>
+      <w:pPr>
+        <w:spacing w:line="240" w:lineRule="auto"/>
+      </w:pPr>
+      <w:r>
+        <w:t>3. Observeer of beide camera’s werken en</w:t>
+      </w:r>
+      <w:r>
+        <w:t xml:space="preserve"> of de camera’s de juiste dingen op het scherm laten zien.</w:t>
+      </w:r>
+    </w:p>
+    <w:p>
+      <w:pPr>
+        <w:spacing w:line="240" w:lineRule="auto"/>
+      </w:pPr>
+      <w:r>
+        <w:t>4. Hou een object op 1, 2 en 3 meter afstand en observeer op de monitor bij de 1, 2 en 3 meter of de afstand van de camera tot het object goed wordt weergegeven</w:t>
+      </w:r>
+    </w:p>
+    <w:p>
+      <w:pPr>
+        <w:spacing w:line="240" w:lineRule="auto"/>
+        <w:rPr>
+          <w:sz w:val="26"/>
+          <w:szCs w:val="26"/>
+        </w:rPr>
+      </w:pPr>
+      <w:r>
+        <w:rPr>
+          <w:sz w:val="26"/>
+          <w:szCs w:val="26"/>
+        </w:rPr>
+        <w:t>Verwachte resultaat</w:t>
+      </w:r>
+    </w:p>
+    <w:p>
+      <w:pPr>
+        <w:spacing w:line="240" w:lineRule="auto"/>
+        <w:rPr>
+          <w:sz w:val="26"/>
+          <w:szCs w:val="26"/>
+        </w:rPr>
+      </w:pPr>
+      <w:r>
+        <w:rPr>
+          <w:sz w:val="26"/>
+          <w:szCs w:val="26"/>
+        </w:rPr>
+        <w:t>De Raspberry PI</w:t>
+      </w:r>
+      <w:r>
+        <w:rPr>
+          <w:sz w:val="26"/>
+          <w:szCs w:val="26"/>
+        </w:rPr>
+        <w:t xml:space="preserve"> zal de afstanden waarop het object van de camera’s staat juist weergegeven worden op het scherm.</w:t>
+      </w:r>
+    </w:p>
+    <w:p>
+      <w:pPr>
+        <w:spacing w:line="240" w:lineRule="auto"/>
+        <w:rPr>
+          <w:sz w:val="26"/>
+          <w:szCs w:val="26"/>
+        </w:rPr>
+      </w:pPr>
+      <w:r>
+        <w:rPr>
+          <w:sz w:val="26"/>
+          <w:szCs w:val="26"/>
+        </w:rPr>
+        <w:t>Acceptatie Criteria:</w:t>
+      </w:r>
+    </w:p>
+    <w:p>
+      <w:pPr>
+        <w:spacing w:line="240" w:lineRule="auto"/>
+        <w:rPr>
+          <w:sz w:val="26"/>
+          <w:szCs w:val="26"/>
+        </w:rPr>
+      </w:pPr>
+      <w:r>
+        <w:rPr>
+          <w:sz w:val="26"/>
+          <w:szCs w:val="26"/>
+        </w:rPr>
+        <w:t>De afstanden zijn juist weergegeven met een maximaal verschil tot de echte afstand van 0.1</w:t>
+      </w:r>
+      <w:r>
+        <w:rPr>
+          <w:sz w:val="26"/>
+          <w:szCs w:val="26"/>
+        </w:rPr>
+        <w:t xml:space="preserve"> m</w:t>
+      </w:r>
+      <w:r>
+        <w:rPr>
+          <w:sz w:val="26"/>
+          <w:szCs w:val="26"/>
+        </w:rPr>
+        <w:t>eter.</w:t>
+      </w:r>
+    </w:p>
+    <w:p>
+      <w:pPr>
+        <w:spacing w:line="240" w:lineRule="auto"/>
+        <w:rPr>
+          <w:sz w:val="26"/>
+          <w:szCs w:val="26"/>
+          <w:lang w:val="en-US"/>
+        </w:rPr>
+      </w:pPr>
+      <w:r>
+        <w:rPr>
+          <w:sz w:val="26"/>
+          <w:szCs w:val="26"/>
+          <w:lang w:val="en-US"/>
+        </w:rPr>
+        <w:t>Waarnemingen</w:t>
+      </w:r>
+      <w:r>
+        <w:rPr>
+          <w:sz w:val="26"/>
+          <w:szCs w:val="26"/>
+          <w:lang w:val="en-US"/>
+        </w:rPr>
+        <w:t>:</w:t>
+      </w:r>
+    </w:p>
+    <w:p>
+      <w:pPr>
+        <w:spacing w:line="240" w:lineRule="auto"/>
+        <w:rPr>
+          <w:sz w:val="26"/>
+          <w:szCs w:val="26"/>
+          <w:lang w:val="en-US"/>
+        </w:rPr>
+      </w:pPr>
+      <w:r>
+        <w:rPr>
+          <w:sz w:val="26"/>
+          <w:szCs w:val="26"/>
+          <w:lang w:val="en-US"/>
+        </w:rPr>
+        <w:t>//TO-DO</w:t>
+      </w:r>
+    </w:p>
+    <w:p>
+      <w:pPr>
+        <w:spacing w:line="240" w:lineRule="auto"/>
+        <w:rPr>
+          <w:sz w:val="26"/>
+          <w:szCs w:val="26"/>
+          <w:lang w:val="en-US"/>
+        </w:rPr>
+      </w:pPr>
+      <w:r>
+        <w:rPr>
+          <w:sz w:val="26"/>
+          <w:szCs w:val="26"/>
+          <w:lang w:val="en-US"/>
+        </w:rPr>
+        <w:t>Conclusie:</w:t>
+      </w:r>
+    </w:p>
+    <w:p>
+      <w:pPr>
+        <w:spacing w:line="240" w:lineRule="auto"/>
+        <w:rPr>
+          <w:sz w:val="26"/>
+          <w:szCs w:val="26"/>
+          <w:lang w:val="en-US"/>
+        </w:rPr>
+      </w:pPr>
+      <w:r>
+        <w:rPr>
+          <w:sz w:val="26"/>
+          <w:szCs w:val="26"/>
+          <w:lang w:val="en-US"/>
+        </w:rPr>
+        <w:t>// TO-D</w:t>
+      </w:r>
+      <w:r>
+        <w:rPr>
+          <w:sz w:val="26"/>
+          <w:szCs w:val="26"/>
+          <w:lang w:val="en-US"/>
+        </w:rPr>
+        <w:t>O</w:t>
+      </w:r>
+      <w:r>
+        <w:rPr>
+          <w:sz w:val="26"/>
+          <w:szCs w:val="26"/>
+          <w:lang w:val="en-US"/>
+        </w:rPr>
+        <w:br w:type="page"/>
+      </w:r>
+    </w:p>
+    <w:p>
+      <w:pPr>
+        <w:pStyle w:val="Kop2"/>
+        <w:spacing w:line="276" w:lineRule="auto"/>
+      </w:pPr>
+      <w:bookmarkStart w:id="3" w:name="_Toc213836356"/>
       <w:r>
         <w:lastRenderedPageBreak/>
         <w:t xml:space="preserve">Test </w:t>
       </w:r>
       <w:r>
-        <w:t>X</w:t>
+        <w:t>3</w:t>
       </w:r>
       <w:r>
         <w:t>: RQ02: GUI</w:t>
       </w:r>
-      <w:bookmarkEnd w:id="5"/>
     </w:p>
     <w:p>
       <w:pPr>
@@ -1855,7 +1519,13 @@
         <w:spacing w:line="276" w:lineRule="auto"/>
       </w:pPr>
       <w:r>
-        <w:t>Voor deze test is er een Raspberry PI nodig --</w:t>
+        <w:t>Voor de benodigde componenten, zie in de Requirement Analyse de ‘Betrokken Componenten’ bij RQ0</w:t>
+      </w:r>
+      <w:r>
+        <w:t>2</w:t>
+      </w:r>
+      <w:r>
+        <w:t xml:space="preserve">. </w:t>
       </w:r>
     </w:p>
     <w:p>
@@ -2023,7 +1693,258 @@
     </w:p>
     <w:p>
       <w:pPr>
+        <w:rPr>
+          <w:rFonts w:asciiTheme="majorHAnsi" w:eastAsiaTheme="majorEastAsia" w:hAnsiTheme="majorHAnsi" w:cstheme="majorBidi"/>
+          <w:color w:val="0F4761" w:themeColor="accent1" w:themeShade="BF"/>
+          <w:sz w:val="32"/>
+          <w:szCs w:val="32"/>
+          <w:lang w:val="en-US"/>
+        </w:rPr>
+      </w:pPr>
+      <w:r>
+        <w:rPr>
+          <w:lang w:val="en-US"/>
+        </w:rPr>
+        <w:br w:type="page"/>
+      </w:r>
+    </w:p>
+    <w:p>
+      <w:pPr>
         <w:pStyle w:val="Kop2"/>
+      </w:pPr>
+      <w:r>
+        <w:lastRenderedPageBreak/>
+        <w:t xml:space="preserve">Test </w:t>
+      </w:r>
+      <w:r>
+        <w:t>4:</w:t>
+      </w:r>
+      <w:r>
+        <w:t xml:space="preserve"> RQ</w:t>
+      </w:r>
+      <w:r>
+        <w:t>04</w:t>
+      </w:r>
+      <w:r>
+        <w:t>: Grafiek</w:t>
+      </w:r>
+      <w:bookmarkEnd w:id="3"/>
+    </w:p>
+    <w:p>
+      <w:pPr>
+        <w:spacing w:line="276" w:lineRule="auto"/>
+        <w:rPr>
+          <w:sz w:val="26"/>
+          <w:szCs w:val="26"/>
+        </w:rPr>
+      </w:pPr>
+      <w:r>
+        <w:rPr>
+          <w:sz w:val="26"/>
+          <w:szCs w:val="26"/>
+        </w:rPr>
+        <w:t>Testdoel:</w:t>
+      </w:r>
+    </w:p>
+    <w:p>
+      <w:pPr>
+        <w:spacing w:line="276" w:lineRule="auto"/>
+      </w:pPr>
+      <w:r>
+        <w:t xml:space="preserve">In deze test wordt er gekeken </w:t>
+      </w:r>
+      <w:r>
+        <w:t xml:space="preserve">naar of de GUI ook een duidelijk en werkend tabel heeft, waarin </w:t>
+      </w:r>
+      <w:r>
+        <w:t xml:space="preserve">de locatie’s van gedetecteerde objecten </w:t>
+      </w:r>
+      <w:r>
+        <w:t>worden laten zien, en elke .5 secondes wordt ge-update</w:t>
+      </w:r>
+      <w:r>
+        <w:t>.</w:t>
+      </w:r>
+    </w:p>
+    <w:p>
+      <w:pPr>
+        <w:spacing w:line="276" w:lineRule="auto"/>
+        <w:rPr>
+          <w:sz w:val="26"/>
+          <w:szCs w:val="26"/>
+        </w:rPr>
+      </w:pPr>
+      <w:r>
+        <w:rPr>
+          <w:sz w:val="26"/>
+          <w:szCs w:val="26"/>
+        </w:rPr>
+        <w:t>Test Opstelling:</w:t>
+      </w:r>
+    </w:p>
+    <w:p>
+      <w:pPr>
+        <w:spacing w:line="276" w:lineRule="auto"/>
+      </w:pPr>
+      <w:r>
+        <w:t xml:space="preserve">Voor deze test is er een </w:t>
+      </w:r>
+      <w:r>
+        <w:t>Raspberry PI nodig, met daarop code om een object te detecteren en weer te geven in een tabel</w:t>
+      </w:r>
+      <w:r>
+        <w:t>.</w:t>
+      </w:r>
+      <w:r>
+        <w:t xml:space="preserve"> </w:t>
+      </w:r>
+      <w:r>
+        <w:t>Er zijn ook camera’s nodig</w:t>
+      </w:r>
+    </w:p>
+    <w:p>
+      <w:pPr>
+        <w:spacing w:line="276" w:lineRule="auto"/>
+        <w:rPr>
+          <w:sz w:val="26"/>
+          <w:szCs w:val="26"/>
+        </w:rPr>
+      </w:pPr>
+      <w:r>
+        <w:rPr>
+          <w:sz w:val="26"/>
+          <w:szCs w:val="26"/>
+        </w:rPr>
+        <w:t>Uitvoering:</w:t>
+      </w:r>
+    </w:p>
+    <w:p>
+      <w:pPr>
+        <w:spacing w:line="276" w:lineRule="auto"/>
+      </w:pPr>
+    </w:p>
+    <w:p>
+      <w:pPr>
+        <w:spacing w:line="276" w:lineRule="auto"/>
+        <w:rPr>
+          <w:sz w:val="26"/>
+          <w:szCs w:val="26"/>
+        </w:rPr>
+      </w:pPr>
+      <w:r>
+        <w:rPr>
+          <w:sz w:val="26"/>
+          <w:szCs w:val="26"/>
+        </w:rPr>
+        <w:t>Verwac</w:t>
+      </w:r>
+      <w:r>
+        <w:rPr>
+          <w:sz w:val="26"/>
+          <w:szCs w:val="26"/>
+        </w:rPr>
+        <w:t>hte Resultaat</w:t>
+      </w:r>
+      <w:r>
+        <w:rPr>
+          <w:sz w:val="26"/>
+          <w:szCs w:val="26"/>
+        </w:rPr>
+        <w:t>:</w:t>
+      </w:r>
+    </w:p>
+    <w:p>
+      <w:pPr>
+        <w:spacing w:line="276" w:lineRule="auto"/>
+      </w:pPr>
+    </w:p>
+    <w:p>
+      <w:pPr>
+        <w:spacing w:line="276" w:lineRule="auto"/>
+        <w:rPr>
+          <w:sz w:val="26"/>
+          <w:szCs w:val="26"/>
+        </w:rPr>
+      </w:pPr>
+      <w:r>
+        <w:rPr>
+          <w:sz w:val="26"/>
+          <w:szCs w:val="26"/>
+        </w:rPr>
+        <w:t>Acceptatie Criteria:</w:t>
+      </w:r>
+    </w:p>
+    <w:p>
+      <w:pPr>
+        <w:spacing w:line="276" w:lineRule="auto"/>
+      </w:pPr>
+    </w:p>
+    <w:p>
+      <w:pPr>
+        <w:spacing w:line="276" w:lineRule="auto"/>
+        <w:rPr>
+          <w:sz w:val="26"/>
+          <w:szCs w:val="26"/>
+          <w:lang w:val="en-US"/>
+        </w:rPr>
+      </w:pPr>
+      <w:r>
+        <w:rPr>
+          <w:sz w:val="26"/>
+          <w:szCs w:val="26"/>
+          <w:lang w:val="en-US"/>
+        </w:rPr>
+        <w:t>Waarnemingen:</w:t>
+      </w:r>
+    </w:p>
+    <w:p>
+      <w:pPr>
+        <w:spacing w:line="276" w:lineRule="auto"/>
+        <w:rPr>
+          <w:lang w:val="en-US"/>
+        </w:rPr>
+      </w:pPr>
+      <w:r>
+        <w:rPr>
+          <w:lang w:val="en-US"/>
+        </w:rPr>
+        <w:t>//To-Do</w:t>
+      </w:r>
+    </w:p>
+    <w:p>
+      <w:pPr>
+        <w:spacing w:line="276" w:lineRule="auto"/>
+        <w:rPr>
+          <w:sz w:val="26"/>
+          <w:szCs w:val="26"/>
+          <w:lang w:val="en-US"/>
+        </w:rPr>
+      </w:pPr>
+      <w:r>
+        <w:rPr>
+          <w:sz w:val="26"/>
+          <w:szCs w:val="26"/>
+          <w:lang w:val="en-US"/>
+        </w:rPr>
+        <w:t>Conclusie:</w:t>
+      </w:r>
+    </w:p>
+    <w:p>
+      <w:pPr>
+        <w:spacing w:line="276" w:lineRule="auto"/>
+        <w:rPr>
+          <w:lang w:val="en-US"/>
+        </w:rPr>
+      </w:pPr>
+      <w:r>
+        <w:rPr>
+          <w:lang w:val="en-US"/>
+        </w:rPr>
+        <w:t>//To-Do</w:t>
+      </w:r>
+    </w:p>
+    <w:p>
+      <w:pPr>
         <w:rPr>
           <w:lang w:val="en-US"/>
         </w:rPr>
@@ -2039,12 +1960,241 @@
       <w:pPr>
         <w:pStyle w:val="Kop2"/>
       </w:pPr>
-      <w:bookmarkStart w:id="6" w:name="_Toc213836359"/>
+      <w:bookmarkStart w:id="4" w:name="_Toc213836357"/>
+      <w:r>
+        <w:lastRenderedPageBreak/>
+        <w:t xml:space="preserve">Test </w:t>
+      </w:r>
+      <w:r>
+        <w:t>5</w:t>
+      </w:r>
+      <w:r>
+        <w:t>: RQ05</w:t>
+      </w:r>
+      <w:r>
+        <w:t>: Camera-Overzicht</w:t>
+      </w:r>
+      <w:bookmarkEnd w:id="4"/>
+    </w:p>
+    <w:p>
+      <w:pPr>
+        <w:spacing w:line="276" w:lineRule="auto"/>
+        <w:rPr>
+          <w:sz w:val="26"/>
+          <w:szCs w:val="26"/>
+        </w:rPr>
+      </w:pPr>
+      <w:r>
+        <w:rPr>
+          <w:sz w:val="26"/>
+          <w:szCs w:val="26"/>
+        </w:rPr>
+        <w:t>Testdoel:</w:t>
+      </w:r>
+    </w:p>
+    <w:p>
+      <w:pPr>
+        <w:spacing w:line="276" w:lineRule="auto"/>
+      </w:pPr>
+      <w:r>
+        <w:t>In deze test wordt er gekeken of</w:t>
+      </w:r>
+      <w:r>
+        <w:t xml:space="preserve"> er een live beeld kan worden genomen uit 1 (of beiden) van de camera’s met een vertraging van maximaal 2 seconde</w:t>
+      </w:r>
+      <w:r>
+        <w:t>n</w:t>
+      </w:r>
+    </w:p>
+    <w:p>
+      <w:pPr>
+        <w:spacing w:line="276" w:lineRule="auto"/>
+        <w:rPr>
+          <w:sz w:val="26"/>
+          <w:szCs w:val="26"/>
+        </w:rPr>
+      </w:pPr>
+      <w:r>
+        <w:rPr>
+          <w:sz w:val="26"/>
+          <w:szCs w:val="26"/>
+        </w:rPr>
+        <w:t>Test Opstelling:</w:t>
+      </w:r>
+    </w:p>
+    <w:p>
+      <w:pPr>
+        <w:spacing w:line="276" w:lineRule="auto"/>
+      </w:pPr>
+      <w:r>
+        <w:t>Voor de benodigde componenten, zie in de Requirement Analyse de ‘Betrokken Componenten’ bij RQ0</w:t>
+      </w:r>
+      <w:r>
+        <w:t>5</w:t>
+      </w:r>
+      <w:r>
+        <w:t xml:space="preserve">. </w:t>
+      </w:r>
+    </w:p>
+    <w:p>
+      <w:pPr>
+        <w:spacing w:line="276" w:lineRule="auto"/>
+        <w:rPr>
+          <w:sz w:val="26"/>
+          <w:szCs w:val="26"/>
+        </w:rPr>
+      </w:pPr>
+      <w:r>
+        <w:rPr>
+          <w:sz w:val="26"/>
+          <w:szCs w:val="26"/>
+        </w:rPr>
+        <w:t>Uitvoering:</w:t>
+      </w:r>
+    </w:p>
+    <w:p>
+      <w:pPr>
+        <w:spacing w:line="276" w:lineRule="auto"/>
+      </w:pPr>
+    </w:p>
+    <w:p>
+      <w:pPr>
+        <w:spacing w:line="276" w:lineRule="auto"/>
+        <w:rPr>
+          <w:sz w:val="26"/>
+          <w:szCs w:val="26"/>
+        </w:rPr>
+      </w:pPr>
+      <w:r>
+        <w:rPr>
+          <w:sz w:val="26"/>
+          <w:szCs w:val="26"/>
+        </w:rPr>
+        <w:t>Verwachte Resultaat:</w:t>
+      </w:r>
+    </w:p>
+    <w:p>
+      <w:pPr>
+        <w:spacing w:line="276" w:lineRule="auto"/>
+      </w:pPr>
+    </w:p>
+    <w:p>
+      <w:pPr>
+        <w:spacing w:line="276" w:lineRule="auto"/>
+        <w:rPr>
+          <w:sz w:val="26"/>
+          <w:szCs w:val="26"/>
+          <w:lang w:val="en-US"/>
+        </w:rPr>
+      </w:pPr>
+      <w:r>
+        <w:rPr>
+          <w:sz w:val="26"/>
+          <w:szCs w:val="26"/>
+          <w:lang w:val="en-US"/>
+        </w:rPr>
+        <w:t>Acceptatie Criteria:</w:t>
+      </w:r>
+    </w:p>
+    <w:p>
+      <w:pPr>
+        <w:spacing w:line="276" w:lineRule="auto"/>
+        <w:rPr>
+          <w:lang w:val="en-US"/>
+        </w:rPr>
+      </w:pPr>
+    </w:p>
+    <w:p>
+      <w:pPr>
+        <w:spacing w:line="276" w:lineRule="auto"/>
+        <w:rPr>
+          <w:sz w:val="26"/>
+          <w:szCs w:val="26"/>
+          <w:lang w:val="en-US"/>
+        </w:rPr>
+      </w:pPr>
+      <w:r>
+        <w:rPr>
+          <w:sz w:val="26"/>
+          <w:szCs w:val="26"/>
+          <w:lang w:val="en-US"/>
+        </w:rPr>
+        <w:t>Waarnemingen:</w:t>
+      </w:r>
+    </w:p>
+    <w:p>
+      <w:pPr>
+        <w:spacing w:line="276" w:lineRule="auto"/>
+        <w:rPr>
+          <w:lang w:val="en-US"/>
+        </w:rPr>
+      </w:pPr>
+      <w:r>
+        <w:rPr>
+          <w:lang w:val="en-US"/>
+        </w:rPr>
+        <w:t>//To-Do</w:t>
+      </w:r>
+    </w:p>
+    <w:p>
+      <w:pPr>
+        <w:spacing w:line="276" w:lineRule="auto"/>
+        <w:rPr>
+          <w:sz w:val="26"/>
+          <w:szCs w:val="26"/>
+          <w:lang w:val="en-US"/>
+        </w:rPr>
+      </w:pPr>
+      <w:r>
+        <w:rPr>
+          <w:sz w:val="26"/>
+          <w:szCs w:val="26"/>
+          <w:lang w:val="en-US"/>
+        </w:rPr>
+        <w:t>Conclusie:</w:t>
+      </w:r>
+    </w:p>
+    <w:p>
+      <w:pPr>
+        <w:spacing w:line="276" w:lineRule="auto"/>
+        <w:rPr>
+          <w:lang w:val="en-US"/>
+        </w:rPr>
+      </w:pPr>
+      <w:r>
+        <w:rPr>
+          <w:lang w:val="en-US"/>
+        </w:rPr>
+        <w:t>//To-Do</w:t>
+      </w:r>
+    </w:p>
+    <w:p>
+      <w:pPr>
+        <w:rPr>
+          <w:rFonts w:asciiTheme="majorHAnsi" w:eastAsiaTheme="majorEastAsia" w:hAnsiTheme="majorHAnsi" w:cstheme="majorBidi"/>
+          <w:color w:val="0F4761" w:themeColor="accent1" w:themeShade="BF"/>
+          <w:sz w:val="32"/>
+          <w:szCs w:val="32"/>
+          <w:lang w:val="en-US"/>
+        </w:rPr>
+      </w:pPr>
+      <w:r>
+        <w:rPr>
+          <w:lang w:val="en-US"/>
+        </w:rPr>
+        <w:br w:type="page"/>
+      </w:r>
+    </w:p>
+    <w:p>
+      <w:pPr>
+        <w:pStyle w:val="Kop2"/>
+      </w:pPr>
+      <w:bookmarkStart w:id="5" w:name="_Toc213836359"/>
       <w:r>
         <w:lastRenderedPageBreak/>
         <w:t>Changelog</w:t>
       </w:r>
-      <w:bookmarkEnd w:id="6"/>
+      <w:bookmarkEnd w:id="5"/>
     </w:p>
     <w:tbl>
       <w:tblPr>
@@ -2273,44 +2423,211 @@
           </w:p>
         </w:tc>
       </w:tr>
+      <w:tr>
+        <w:tc>
+          <w:tcPr>
+            <w:tcW w:w="988" w:type="dxa"/>
+          </w:tcPr>
+          <w:p>
+            <w:pPr>
+              <w:rPr>
+                <w:sz w:val="26"/>
+                <w:szCs w:val="26"/>
+              </w:rPr>
+            </w:pPr>
+            <w:r>
+              <w:rPr>
+                <w:sz w:val="26"/>
+                <w:szCs w:val="26"/>
+              </w:rPr>
+              <w:t>1.2</w:t>
+            </w:r>
+          </w:p>
+        </w:tc>
+        <w:tc>
+          <w:tcPr>
+            <w:tcW w:w="6520" w:type="dxa"/>
+          </w:tcPr>
+          <w:p>
+            <w:pPr>
+              <w:rPr>
+                <w:sz w:val="26"/>
+                <w:szCs w:val="26"/>
+                <w:lang w:val="en-US"/>
+              </w:rPr>
+            </w:pPr>
+            <w:r>
+              <w:rPr>
+                <w:sz w:val="26"/>
+                <w:szCs w:val="26"/>
+                <w:lang w:val="en-US"/>
+              </w:rPr>
+              <w:t xml:space="preserve">Feedback toegepast, Requirement Analyse </w:t>
+            </w:r>
+            <w:r>
+              <w:rPr>
+                <w:sz w:val="26"/>
+                <w:szCs w:val="26"/>
+                <w:lang w:val="en-US"/>
+              </w:rPr>
+              <w:t>connectie.</w:t>
+            </w:r>
+          </w:p>
+        </w:tc>
+        <w:tc>
+          <w:tcPr>
+            <w:tcW w:w="1554" w:type="dxa"/>
+          </w:tcPr>
+          <w:p>
+            <w:pPr>
+              <w:rPr>
+                <w:sz w:val="26"/>
+                <w:szCs w:val="26"/>
+                <w:lang w:val="en-US"/>
+              </w:rPr>
+            </w:pPr>
+            <w:r>
+              <w:rPr>
+                <w:sz w:val="26"/>
+                <w:szCs w:val="26"/>
+                <w:lang w:val="en-US"/>
+              </w:rPr>
+              <w:t>16-12-2025</w:t>
+            </w:r>
+          </w:p>
+        </w:tc>
+      </w:tr>
+      <w:tr>
+        <w:tc>
+          <w:tcPr>
+            <w:tcW w:w="988" w:type="dxa"/>
+          </w:tcPr>
+          <w:p>
+            <w:pPr>
+              <w:rPr>
+                <w:sz w:val="26"/>
+                <w:szCs w:val="26"/>
+                <w:lang w:val="en-US"/>
+              </w:rPr>
+            </w:pPr>
+          </w:p>
+        </w:tc>
+        <w:tc>
+          <w:tcPr>
+            <w:tcW w:w="6520" w:type="dxa"/>
+          </w:tcPr>
+          <w:p>
+            <w:pPr>
+              <w:rPr>
+                <w:sz w:val="26"/>
+                <w:szCs w:val="26"/>
+                <w:lang w:val="en-US"/>
+              </w:rPr>
+            </w:pPr>
+          </w:p>
+        </w:tc>
+        <w:tc>
+          <w:tcPr>
+            <w:tcW w:w="1554" w:type="dxa"/>
+          </w:tcPr>
+          <w:p>
+            <w:pPr>
+              <w:rPr>
+                <w:sz w:val="26"/>
+                <w:szCs w:val="26"/>
+                <w:lang w:val="en-US"/>
+              </w:rPr>
+            </w:pPr>
+          </w:p>
+        </w:tc>
+      </w:tr>
+      <w:tr>
+        <w:tc>
+          <w:tcPr>
+            <w:tcW w:w="988" w:type="dxa"/>
+          </w:tcPr>
+          <w:p>
+            <w:pPr>
+              <w:rPr>
+                <w:sz w:val="26"/>
+                <w:szCs w:val="26"/>
+                <w:lang w:val="en-US"/>
+              </w:rPr>
+            </w:pPr>
+          </w:p>
+        </w:tc>
+        <w:tc>
+          <w:tcPr>
+            <w:tcW w:w="6520" w:type="dxa"/>
+          </w:tcPr>
+          <w:p>
+            <w:pPr>
+              <w:rPr>
+                <w:sz w:val="26"/>
+                <w:szCs w:val="26"/>
+                <w:lang w:val="en-US"/>
+              </w:rPr>
+            </w:pPr>
+          </w:p>
+        </w:tc>
+        <w:tc>
+          <w:tcPr>
+            <w:tcW w:w="1554" w:type="dxa"/>
+          </w:tcPr>
+          <w:p>
+            <w:pPr>
+              <w:rPr>
+                <w:sz w:val="26"/>
+                <w:szCs w:val="26"/>
+                <w:lang w:val="en-US"/>
+              </w:rPr>
+            </w:pPr>
+          </w:p>
+        </w:tc>
+      </w:tr>
     </w:tbl>
     <w:p>
       <w:pPr>
         <w:rPr>
           <w:sz w:val="26"/>
           <w:szCs w:val="26"/>
-        </w:rPr>
-      </w:pPr>
-    </w:p>
-    <w:p>
-      <w:pPr>
-        <w:rPr>
-          <w:sz w:val="26"/>
-          <w:szCs w:val="26"/>
-        </w:rPr>
-      </w:pPr>
-    </w:p>
-    <w:p>
-      <w:pPr>
-        <w:rPr>
-          <w:sz w:val="26"/>
-          <w:szCs w:val="26"/>
-        </w:rPr>
-      </w:pPr>
-    </w:p>
-    <w:p>
-      <w:pPr>
-        <w:rPr>
-          <w:sz w:val="26"/>
-          <w:szCs w:val="26"/>
-        </w:rPr>
-      </w:pPr>
-    </w:p>
-    <w:p>
-      <w:pPr>
-        <w:rPr>
-          <w:sz w:val="26"/>
-          <w:szCs w:val="26"/>
+          <w:lang w:val="en-US"/>
+        </w:rPr>
+      </w:pPr>
+    </w:p>
+    <w:p>
+      <w:pPr>
+        <w:rPr>
+          <w:sz w:val="26"/>
+          <w:szCs w:val="26"/>
+          <w:lang w:val="en-US"/>
+        </w:rPr>
+      </w:pPr>
+    </w:p>
+    <w:p>
+      <w:pPr>
+        <w:rPr>
+          <w:sz w:val="26"/>
+          <w:szCs w:val="26"/>
+          <w:lang w:val="en-US"/>
+        </w:rPr>
+      </w:pPr>
+    </w:p>
+    <w:p>
+      <w:pPr>
+        <w:rPr>
+          <w:sz w:val="26"/>
+          <w:szCs w:val="26"/>
+          <w:lang w:val="en-US"/>
+        </w:rPr>
+      </w:pPr>
+    </w:p>
+    <w:p>
+      <w:pPr>
+        <w:rPr>
+          <w:sz w:val="26"/>
+          <w:szCs w:val="26"/>
+          <w:lang w:val="en-US"/>
         </w:rPr>
       </w:pPr>
     </w:p>

</xml_diff>

<commit_message>
code en test update
in Main2 toegevoegd wat is aangepast van de originele main.
En de Testen een klein beetje je-tweak-d
</commit_message>
<xml_diff>
--- a/Opleverset_Project_5-6/Verslagen/Testrapport.docx
+++ b/Opleverset_Project_5-6/Verslagen/Testrapport.docx
@@ -11,7 +11,6 @@
           <w:lang w:val="en-US"/>
         </w:rPr>
       </w:pPr>
-      <w:proofErr w:type="spellStart"/>
       <w:r>
         <w:rPr>
           <w:sz w:val="36"/>
@@ -20,7 +19,6 @@
         </w:rPr>
         <w:t>Testrapport</w:t>
       </w:r>
-      <w:proofErr w:type="spellEnd"/>
     </w:p>
     <w:p>
       <w:pPr>
@@ -222,16 +220,8 @@
         <w:rPr>
           <w:lang w:val="en-US"/>
         </w:rPr>
-        <w:t xml:space="preserve">Dennis </w:t>
-      </w:r>
-      <w:proofErr w:type="spellStart"/>
-      <w:r>
-        <w:rPr>
-          <w:lang w:val="en-US"/>
-        </w:rPr>
-        <w:t>Zejnilovic</w:t>
-      </w:r>
-      <w:proofErr w:type="spellEnd"/>
+        <w:t>Dennis Zejnilovic</w:t>
+      </w:r>
       <w:r>
         <w:rPr>
           <w:lang w:val="en-US"/>
@@ -250,21 +240,7 @@
         <w:rPr>
           <w:lang w:val="en-US"/>
         </w:rPr>
-        <w:t xml:space="preserve">Ali </w:t>
-      </w:r>
-      <w:proofErr w:type="spellStart"/>
-      <w:r>
-        <w:rPr>
-          <w:lang w:val="en-US"/>
-        </w:rPr>
-        <w:t>Haimed</w:t>
-      </w:r>
-      <w:proofErr w:type="spellEnd"/>
-      <w:r>
-        <w:rPr>
-          <w:lang w:val="en-US"/>
-        </w:rPr>
-        <w:t xml:space="preserve"> </w:t>
+        <w:t xml:space="preserve">Ali Haimed </w:t>
       </w:r>
       <w:r>
         <w:rPr>
@@ -913,15 +889,7 @@
         <w:spacing w:line="276" w:lineRule="auto"/>
       </w:pPr>
       <w:r>
-        <w:t xml:space="preserve">Voor de benodigde componenten, zie in de </w:t>
-      </w:r>
-      <w:proofErr w:type="spellStart"/>
-      <w:r>
-        <w:t>Requirement</w:t>
-      </w:r>
-      <w:proofErr w:type="spellEnd"/>
-      <w:r>
-        <w:t xml:space="preserve"> Analyse de ‘Betrokken Componenten’ bij RQ05. </w:t>
+        <w:t xml:space="preserve">Voor de benodigde componenten, zie in de Requirement Analyse de ‘Betrokken Componenten’ bij RQ05. </w:t>
       </w:r>
     </w:p>
     <w:p>
@@ -945,47 +913,24 @@
         <w:spacing w:line="276" w:lineRule="auto"/>
       </w:pPr>
       <w:r>
-        <w:t xml:space="preserve">1. Verbind de camera’s/camera met de juiste kabels (USB voor </w:t>
-      </w:r>
-      <w:proofErr w:type="spellStart"/>
-      <w:r>
-        <w:t>Arducam</w:t>
-      </w:r>
-      <w:proofErr w:type="spellEnd"/>
-      <w:r>
-        <w:t xml:space="preserve">, </w:t>
-      </w:r>
-      <w:proofErr w:type="spellStart"/>
-      <w:r>
-        <w:t>ribbon</w:t>
-      </w:r>
-      <w:proofErr w:type="spellEnd"/>
-      <w:r>
-        <w:t xml:space="preserve"> kabel voor Waveshare) en voorzie de </w:t>
-      </w:r>
-      <w:proofErr w:type="spellStart"/>
-      <w:r>
-        <w:t>Raspberry</w:t>
-      </w:r>
-      <w:proofErr w:type="spellEnd"/>
-      <w:r>
-        <w:t xml:space="preserve"> PI van stroom.</w:t>
-      </w:r>
-    </w:p>
-    <w:p>
-      <w:pPr>
-        <w:spacing w:line="276" w:lineRule="auto"/>
-      </w:pPr>
-      <w:r>
-        <w:t xml:space="preserve">2. Run via de </w:t>
-      </w:r>
-      <w:proofErr w:type="spellStart"/>
-      <w:r>
-        <w:t>Raspberry</w:t>
-      </w:r>
-      <w:proofErr w:type="spellEnd"/>
-      <w:r>
-        <w:t xml:space="preserve"> PI het code bestand ‘main.py’ door in de terminal onder pad ‘~/Project5-6/Opleverset_Project_5-6/Code’ ‘python main.py’ in te typen en op enter te drukken.</w:t>
+        <w:t xml:space="preserve">1. </w:t>
+      </w:r>
+      <w:r>
+        <w:t xml:space="preserve">Verbind de camera’s met de </w:t>
+      </w:r>
+      <w:r>
+        <w:t>USB kabel die daaraan vast zit aan de Raspberry PI</w:t>
+      </w:r>
+      <w:r>
+        <w:t xml:space="preserve"> en voorzie de Raspberry PI van stroom.</w:t>
+      </w:r>
+    </w:p>
+    <w:p>
+      <w:pPr>
+        <w:spacing w:line="276" w:lineRule="auto"/>
+      </w:pPr>
+      <w:r>
+        <w:t>2. Run via de Raspberry PI het code bestand ‘main.py’ door in de terminal onder pad ‘~/Project5-6/Opleverset_Project_5-6/Code’ ‘python main.py’ in te typen en op enter te drukken.</w:t>
       </w:r>
     </w:p>
     <w:p>
@@ -1004,15 +949,7 @@
         <w:spacing w:line="276" w:lineRule="auto"/>
       </w:pPr>
       <w:r>
-        <w:t xml:space="preserve">4. Observeer de </w:t>
-      </w:r>
-      <w:proofErr w:type="spellStart"/>
-      <w:r>
-        <w:t>latency</w:t>
-      </w:r>
-      <w:proofErr w:type="spellEnd"/>
-      <w:r>
-        <w:t>.</w:t>
+        <w:t>4. Observeer de latency.</w:t>
       </w:r>
     </w:p>
     <w:p>
@@ -1047,6 +984,9 @@
       <w:r>
         <w:t>van &lt;= 2 secondes</w:t>
       </w:r>
+      <w:r>
+        <w:t xml:space="preserve"> (200 ms)</w:t>
+      </w:r>
     </w:p>
     <w:p>
       <w:pPr>
@@ -1098,33 +1038,26 @@
       <w:r>
         <w:t xml:space="preserve"> met een vertraging van &lt;= 2 secondes</w:t>
       </w:r>
-    </w:p>
-    <w:p>
-      <w:pPr>
-        <w:spacing w:line="276" w:lineRule="auto"/>
-        <w:rPr>
-          <w:sz w:val="26"/>
-          <w:szCs w:val="26"/>
-          <w:lang w:val="en-US"/>
-        </w:rPr>
-      </w:pPr>
-      <w:proofErr w:type="spellStart"/>
-      <w:r>
-        <w:rPr>
-          <w:sz w:val="26"/>
-          <w:szCs w:val="26"/>
-          <w:lang w:val="en-US"/>
-        </w:rPr>
-        <w:t>Waarnemingen</w:t>
-      </w:r>
-      <w:proofErr w:type="spellEnd"/>
-      <w:r>
-        <w:rPr>
-          <w:sz w:val="26"/>
-          <w:szCs w:val="26"/>
-          <w:lang w:val="en-US"/>
-        </w:rPr>
-        <w:t>:</w:t>
+      <w:r>
+        <w:t xml:space="preserve"> (200 ms)</w:t>
+      </w:r>
+    </w:p>
+    <w:p>
+      <w:pPr>
+        <w:spacing w:line="276" w:lineRule="auto"/>
+        <w:rPr>
+          <w:sz w:val="26"/>
+          <w:szCs w:val="26"/>
+          <w:lang w:val="en-US"/>
+        </w:rPr>
+      </w:pPr>
+      <w:r>
+        <w:rPr>
+          <w:sz w:val="26"/>
+          <w:szCs w:val="26"/>
+          <w:lang w:val="en-US"/>
+        </w:rPr>
+        <w:t>Waarnemingen:</w:t>
       </w:r>
     </w:p>
     <w:p>
@@ -1150,23 +1083,13 @@
           <w:lang w:val="en-US"/>
         </w:rPr>
       </w:pPr>
-      <w:proofErr w:type="spellStart"/>
-      <w:r>
-        <w:rPr>
-          <w:sz w:val="26"/>
-          <w:szCs w:val="26"/>
-          <w:lang w:val="en-US"/>
-        </w:rPr>
-        <w:t>Conclusie</w:t>
-      </w:r>
-      <w:proofErr w:type="spellEnd"/>
-      <w:r>
-        <w:rPr>
-          <w:sz w:val="26"/>
-          <w:szCs w:val="26"/>
-          <w:lang w:val="en-US"/>
-        </w:rPr>
-        <w:t>:</w:t>
+      <w:r>
+        <w:rPr>
+          <w:sz w:val="26"/>
+          <w:szCs w:val="26"/>
+          <w:lang w:val="en-US"/>
+        </w:rPr>
+        <w:t>Conclusie:</w:t>
       </w:r>
     </w:p>
     <w:p>
@@ -1289,15 +1212,7 @@
         <w:spacing w:line="276" w:lineRule="auto"/>
       </w:pPr>
       <w:r>
-        <w:t xml:space="preserve">Voor de benodigde componenten, zie in de </w:t>
-      </w:r>
-      <w:proofErr w:type="spellStart"/>
-      <w:r>
-        <w:t>Requirement</w:t>
-      </w:r>
-      <w:proofErr w:type="spellEnd"/>
-      <w:r>
-        <w:t xml:space="preserve"> Analyse</w:t>
+        <w:t>Voor de benodigde componenten, zie in de Requirement Analyse</w:t>
       </w:r>
       <w:r>
         <w:t xml:space="preserve"> de ‘Betrokken Componenten’ bij RQ01. Deze test wordt gedaan met een object dat op 1, 2 en 3 meter va</w:t>
@@ -1327,34 +1242,19 @@
         <w:spacing w:line="276" w:lineRule="auto"/>
       </w:pPr>
       <w:r>
-        <w:t>1. Verbind de camera’s/camera</w:t>
-      </w:r>
-      <w:r>
-        <w:t xml:space="preserve"> met de juiste kabels (USB voor </w:t>
-      </w:r>
-      <w:proofErr w:type="spellStart"/>
-      <w:r>
-        <w:t>Arducam</w:t>
-      </w:r>
-      <w:proofErr w:type="spellEnd"/>
-      <w:r>
-        <w:t xml:space="preserve">, </w:t>
-      </w:r>
-      <w:proofErr w:type="spellStart"/>
-      <w:r>
-        <w:t>ribbon</w:t>
-      </w:r>
-      <w:proofErr w:type="spellEnd"/>
-      <w:r>
-        <w:t xml:space="preserve"> kabel voor Waveshare) en voorzie de </w:t>
-      </w:r>
-      <w:proofErr w:type="spellStart"/>
-      <w:r>
-        <w:t>Raspberry</w:t>
-      </w:r>
-      <w:proofErr w:type="spellEnd"/>
-      <w:r>
-        <w:t xml:space="preserve"> PI van stroom.</w:t>
+        <w:t>1. Verbind de camera’s</w:t>
+      </w:r>
+      <w:r>
+        <w:t xml:space="preserve"> met de </w:t>
+      </w:r>
+      <w:r>
+        <w:t>USB kabel die daar</w:t>
+      </w:r>
+      <w:r>
+        <w:t>aan vast zit aan de Raspberry PI</w:t>
+      </w:r>
+      <w:r>
+        <w:t xml:space="preserve"> en voorzie de Raspberry PI van stroom.</w:t>
       </w:r>
     </w:p>
     <w:p>
@@ -1365,15 +1265,7 @@
         <w:t>2.</w:t>
       </w:r>
       <w:r>
-        <w:t xml:space="preserve"> Run via de </w:t>
-      </w:r>
-      <w:proofErr w:type="spellStart"/>
-      <w:r>
-        <w:t>Raspberry</w:t>
-      </w:r>
-      <w:proofErr w:type="spellEnd"/>
-      <w:r>
-        <w:t xml:space="preserve"> PI het code bestand ‘main.py’ door in de terminal onder pad ‘~/Project5-6/Opleverset_Project_5-6/Code’ ‘python main.py’ in te typen en op enter te drukken.</w:t>
+        <w:t xml:space="preserve"> Run via de Raspberry PI het code bestand ‘main.py’ door in de terminal onder pad ‘~/Project5-6/Opleverset_Project_5-6/Code’ ‘python main.py’ in te typen en op enter te drukken.</w:t>
       </w:r>
     </w:p>
     <w:p>
@@ -1437,15 +1329,7 @@
         <w:spacing w:line="276" w:lineRule="auto"/>
       </w:pPr>
       <w:r>
-        <w:t xml:space="preserve">De </w:t>
-      </w:r>
-      <w:proofErr w:type="spellStart"/>
-      <w:r>
-        <w:t>Raspberry</w:t>
-      </w:r>
-      <w:proofErr w:type="spellEnd"/>
-      <w:r>
-        <w:t xml:space="preserve"> PI zal op het scherm het object </w:t>
+        <w:t xml:space="preserve">De Raspberry PI zal op het scherm het object </w:t>
       </w:r>
       <w:r>
         <w:t>detecteren vanaf alle 3 de afstanden.</w:t>
@@ -1641,15 +1525,7 @@
         <w:spacing w:line="276" w:lineRule="auto"/>
       </w:pPr>
       <w:r>
-        <w:t xml:space="preserve">Voor de benodigde componenten, zie in de </w:t>
-      </w:r>
-      <w:proofErr w:type="spellStart"/>
-      <w:r>
-        <w:t>Requirement</w:t>
-      </w:r>
-      <w:proofErr w:type="spellEnd"/>
-      <w:r>
-        <w:t xml:space="preserve"> Analyse de ‘Betrokken Componenten’ bij RQ03. Deze test wordt gedaan met een object dat op 1, 2 en 3 meter van de camera afgehouden wordt.</w:t>
+        <w:t>Voor de benodigde componenten, zie in de Requirement Analyse de ‘Betrokken Componenten’ bij RQ03. Deze test wordt gedaan met een object dat op 1, 2 en 3 meter van de camera afgehouden wordt.</w:t>
       </w:r>
     </w:p>
     <w:p>
@@ -1673,31 +1549,16 @@
         <w:spacing w:line="240" w:lineRule="auto"/>
       </w:pPr>
       <w:r>
-        <w:t xml:space="preserve">1. Verbind de camera’s/camera met de juiste kabels (USB voor </w:t>
-      </w:r>
-      <w:proofErr w:type="spellStart"/>
-      <w:r>
-        <w:t>Arducam</w:t>
-      </w:r>
-      <w:proofErr w:type="spellEnd"/>
-      <w:r>
-        <w:t xml:space="preserve">, </w:t>
-      </w:r>
-      <w:proofErr w:type="spellStart"/>
-      <w:r>
-        <w:t>ribbon</w:t>
-      </w:r>
-      <w:proofErr w:type="spellEnd"/>
-      <w:r>
-        <w:t xml:space="preserve"> kabel voor Waveshare) en voorzie de </w:t>
-      </w:r>
-      <w:proofErr w:type="spellStart"/>
-      <w:r>
-        <w:t>Raspberry</w:t>
-      </w:r>
-      <w:proofErr w:type="spellEnd"/>
-      <w:r>
-        <w:t xml:space="preserve"> PI van stroom.</w:t>
+        <w:t xml:space="preserve">1. </w:t>
+      </w:r>
+      <w:r>
+        <w:t xml:space="preserve">Verbind de camera’s met de </w:t>
+      </w:r>
+      <w:r>
+        <w:t>USB kabel die daaraan vast zit aan de Raspberry PI</w:t>
+      </w:r>
+      <w:r>
+        <w:t xml:space="preserve"> en voorzie de Raspberry PI van stroom.</w:t>
       </w:r>
     </w:p>
     <w:p>
@@ -1705,15 +1566,7 @@
         <w:spacing w:line="240" w:lineRule="auto"/>
       </w:pPr>
       <w:r>
-        <w:t xml:space="preserve">2. Run via de </w:t>
-      </w:r>
-      <w:proofErr w:type="spellStart"/>
-      <w:r>
-        <w:t>Raspberry</w:t>
-      </w:r>
-      <w:proofErr w:type="spellEnd"/>
-      <w:r>
-        <w:t xml:space="preserve"> PI het code bestand ‘main.py’ door in de terminal onder pad ‘~/Project5-6/Opleverset_Project_5-6/Code’ ‘python main.py’ in te typen en op enter te drukken.</w:t>
+        <w:t>2. Run via de Raspberry PI het code bestand ‘main.py’ door in de terminal onder pad ‘~/Project5-6/Opleverset_Project_5-6/Code’ ‘python main.py’ in te typen en op enter te drukken.</w:t>
       </w:r>
     </w:p>
     <w:p>
@@ -1753,15 +1606,7 @@
         <w:spacing w:line="240" w:lineRule="auto"/>
       </w:pPr>
       <w:r>
-        <w:t xml:space="preserve">De </w:t>
-      </w:r>
-      <w:proofErr w:type="spellStart"/>
-      <w:r>
-        <w:t>Raspberry</w:t>
-      </w:r>
-      <w:proofErr w:type="spellEnd"/>
-      <w:r>
-        <w:t xml:space="preserve"> PI</w:t>
+        <w:t>De Raspberry PI</w:t>
       </w:r>
       <w:r>
         <w:t xml:space="preserve"> zal de afstanden waarop het object van de camera’s staat juist weergegeven worden op het scherm.</w:t>
@@ -1916,15 +1761,7 @@
         <w:br/>
       </w:r>
       <w:r>
-        <w:t xml:space="preserve">In deze test gaat er gekeken worden of er een GUI is met daarin duidelijke en overzichtelijke data. Die data bestaat uit een afstand vanaf de camera tot de </w:t>
-      </w:r>
-      <w:proofErr w:type="spellStart"/>
-      <w:r>
-        <w:t>Raspberry</w:t>
-      </w:r>
-      <w:proofErr w:type="spellEnd"/>
-      <w:r>
-        <w:t xml:space="preserve"> PI, een feed van de Camera’s en een indicatie van wat er gedetecteerd is.</w:t>
+        <w:t>In deze test gaat er gekeken worden of er een GUI is met daarin duidelijke en overzichtelijke data. Die data bestaat uit een afstand vanaf de camera tot de Raspberry PI, een feed van de Camera’s en een indicatie van wat er gedetecteerd is.</w:t>
       </w:r>
       <w:r>
         <w:rPr>
@@ -1934,21 +1771,24 @@
         <w:br/>
         <w:t>Test Opstelling:</w:t>
       </w:r>
-    </w:p>
-    <w:p>
-      <w:pPr>
-        <w:spacing w:line="276" w:lineRule="auto"/>
-      </w:pPr>
-      <w:r>
-        <w:t xml:space="preserve">Voor de benodigde componenten, zie in de </w:t>
-      </w:r>
-      <w:proofErr w:type="spellStart"/>
-      <w:r>
-        <w:t>Requirement</w:t>
-      </w:r>
-      <w:proofErr w:type="spellEnd"/>
-      <w:r>
-        <w:t xml:space="preserve"> Analyse de ‘Betrokken Componenten’ bij RQ0</w:t>
+      <w:r>
+        <w:rPr>
+          <w:sz w:val="26"/>
+          <w:szCs w:val="26"/>
+        </w:rPr>
+        <w:t xml:space="preserve"> </w:t>
+      </w:r>
+    </w:p>
+    <w:p>
+      <w:pPr>
+        <w:spacing w:line="276" w:lineRule="auto"/>
+        <w:rPr>
+          <w:sz w:val="26"/>
+          <w:szCs w:val="26"/>
+        </w:rPr>
+      </w:pPr>
+      <w:r>
+        <w:t>Voor de benodigde componenten, zie in de Requirement Analyse de ‘Betrokken Componenten’ bij RQ0</w:t>
       </w:r>
       <w:r>
         <w:t>2</w:t>
@@ -1978,15 +1818,7 @@
         <w:spacing w:line="276" w:lineRule="auto"/>
       </w:pPr>
       <w:r>
-        <w:t xml:space="preserve">// </w:t>
-      </w:r>
-      <w:proofErr w:type="spellStart"/>
-      <w:r>
-        <w:t>To</w:t>
-      </w:r>
-      <w:proofErr w:type="spellEnd"/>
-      <w:r>
-        <w:t>-Do</w:t>
+        <w:t>// To-Do</w:t>
       </w:r>
     </w:p>
     <w:p>
@@ -2010,15 +1842,7 @@
         <w:spacing w:line="276" w:lineRule="auto"/>
       </w:pPr>
       <w:r>
-        <w:t xml:space="preserve">De </w:t>
-      </w:r>
-      <w:proofErr w:type="spellStart"/>
-      <w:r>
-        <w:t>Raspberry</w:t>
-      </w:r>
-      <w:proofErr w:type="spellEnd"/>
-      <w:r>
-        <w:t xml:space="preserve"> PI zal de benodigde data goed laten zien.</w:t>
+        <w:t>De Raspberry PI zal de benodigde data goed laten zien.</w:t>
       </w:r>
     </w:p>
     <w:p>
@@ -2222,13 +2046,8 @@
       <w:r>
         <w:t xml:space="preserve">Voor deze test is er een </w:t>
       </w:r>
-      <w:proofErr w:type="spellStart"/>
-      <w:r>
-        <w:t>Raspberry</w:t>
-      </w:r>
-      <w:proofErr w:type="spellEnd"/>
-      <w:r>
-        <w:t xml:space="preserve"> PI nodig, met daarop code om een object te detecteren en weer te geven in een tabel</w:t>
+      <w:r>
+        <w:t>Raspberry PI nodig, met daarop code om een object te detecteren en weer te geven in een tabel</w:t>
       </w:r>
       <w:r>
         <w:t>.</w:t>
@@ -2237,7 +2056,16 @@
         <w:t xml:space="preserve"> </w:t>
       </w:r>
       <w:r>
-        <w:t>Er zijn ook camera’s nodig</w:t>
+        <w:t>Er zijn ook camera</w:t>
+      </w:r>
+      <w:r>
+        <w:t>’</w:t>
+      </w:r>
+      <w:r>
+        <w:t>s nodig</w:t>
+      </w:r>
+      <w:r>
+        <w:t xml:space="preserve"> die zijn aa</w:t>
       </w:r>
     </w:p>
     <w:p>
@@ -2341,23 +2169,13 @@
           <w:lang w:val="en-US"/>
         </w:rPr>
       </w:pPr>
-      <w:proofErr w:type="spellStart"/>
-      <w:r>
-        <w:rPr>
-          <w:sz w:val="26"/>
-          <w:szCs w:val="26"/>
-          <w:lang w:val="en-US"/>
-        </w:rPr>
-        <w:t>Waarnemingen</w:t>
-      </w:r>
-      <w:proofErr w:type="spellEnd"/>
-      <w:r>
-        <w:rPr>
-          <w:sz w:val="26"/>
-          <w:szCs w:val="26"/>
-          <w:lang w:val="en-US"/>
-        </w:rPr>
-        <w:t>:</w:t>
+      <w:r>
+        <w:rPr>
+          <w:sz w:val="26"/>
+          <w:szCs w:val="26"/>
+          <w:lang w:val="en-US"/>
+        </w:rPr>
+        <w:t>Waarnemingen:</w:t>
       </w:r>
     </w:p>
     <w:p>
@@ -2383,23 +2201,13 @@
           <w:lang w:val="en-US"/>
         </w:rPr>
       </w:pPr>
-      <w:proofErr w:type="spellStart"/>
-      <w:r>
-        <w:rPr>
-          <w:sz w:val="26"/>
-          <w:szCs w:val="26"/>
-          <w:lang w:val="en-US"/>
-        </w:rPr>
-        <w:t>Conclusie</w:t>
-      </w:r>
-      <w:proofErr w:type="spellEnd"/>
-      <w:r>
-        <w:rPr>
-          <w:sz w:val="26"/>
-          <w:szCs w:val="26"/>
-          <w:lang w:val="en-US"/>
-        </w:rPr>
-        <w:t>:</w:t>
+      <w:r>
+        <w:rPr>
+          <w:sz w:val="26"/>
+          <w:szCs w:val="26"/>
+          <w:lang w:val="en-US"/>
+        </w:rPr>
+        <w:t>Conclusie:</w:t>
       </w:r>
     </w:p>
     <w:p>
@@ -2720,61 +2528,15 @@
                 <w:szCs w:val="26"/>
                 <w:lang w:val="en-US"/>
               </w:rPr>
-              <w:t xml:space="preserve">Feedback </w:t>
-            </w:r>
-            <w:proofErr w:type="spellStart"/>
+              <w:t xml:space="preserve">Feedback toegepast, Requirement Analyse </w:t>
+            </w:r>
             <w:r>
               <w:rPr>
                 <w:sz w:val="26"/>
                 <w:szCs w:val="26"/>
                 <w:lang w:val="en-US"/>
               </w:rPr>
-              <w:t>toegepast</w:t>
-            </w:r>
-            <w:proofErr w:type="spellEnd"/>
-            <w:r>
-              <w:rPr>
-                <w:sz w:val="26"/>
-                <w:szCs w:val="26"/>
-                <w:lang w:val="en-US"/>
-              </w:rPr>
-              <w:t xml:space="preserve">, Requirement </w:t>
-            </w:r>
-            <w:proofErr w:type="spellStart"/>
-            <w:r>
-              <w:rPr>
-                <w:sz w:val="26"/>
-                <w:szCs w:val="26"/>
-                <w:lang w:val="en-US"/>
-              </w:rPr>
-              <w:t>Analyse</w:t>
-            </w:r>
-            <w:proofErr w:type="spellEnd"/>
-            <w:r>
-              <w:rPr>
-                <w:sz w:val="26"/>
-                <w:szCs w:val="26"/>
-                <w:lang w:val="en-US"/>
-              </w:rPr>
-              <w:t xml:space="preserve"> </w:t>
-            </w:r>
-            <w:proofErr w:type="spellStart"/>
-            <w:r>
-              <w:rPr>
-                <w:sz w:val="26"/>
-                <w:szCs w:val="26"/>
-                <w:lang w:val="en-US"/>
-              </w:rPr>
-              <w:t>connectie</w:t>
-            </w:r>
-            <w:proofErr w:type="spellEnd"/>
-            <w:r>
-              <w:rPr>
-                <w:sz w:val="26"/>
-                <w:szCs w:val="26"/>
-                <w:lang w:val="en-US"/>
-              </w:rPr>
-              <w:t>.</w:t>
+              <w:t>connectie.</w:t>
             </w:r>
           </w:p>
         </w:tc>

</xml_diff>